<commit_message>
Document FT Send filter criteria in the SOP
Co-Authored-By: Claude Opus 5.5 <noreply@anthropic.com>
Claude-Session: https://claude.ai/code/session_013DfoHr5TuhrWfy46zgxpYj
</commit_message>
<xml_diff>
--- a/docs/sop/Field Ticket PDF and E-Sign SOP.docx
+++ b/docs/sop/Field Ticket PDF and E-Sign SOP.docx
@@ -186,7 +186,7 @@
             </w:tcMar>
           </w:tcPr>
           <w:p>
-            <w:hyperlink w:history="1" r:id="rIdhbl7gkvoumx7vtegluzre">
+            <w:hyperlink w:history="1" r:id="rIdbxi8i1k6a07xggkswsisa">
               <w:r>
                 <w:rPr>
                   <w:rStyle w:val="Hyperlink"/>
@@ -318,7 +318,7 @@
         </w:numPr>
         <w:spacing w:after="80"/>
       </w:pPr>
-      <w:hyperlink w:history="1" r:id="rIdrsjvjwsiq1nnzv5bci5wz">
+      <w:hyperlink w:history="1" r:id="rIdqfdcxijatpsga5b07o1xz">
         <w:r>
           <w:rPr>
             <w:rStyle w:val="Hyperlink"/>
@@ -394,7 +394,7 @@
       <w:r>
         <w:t xml:space="preserve">: </w:t>
       </w:r>
-      <w:hyperlink w:history="1" r:id="rIdkx5jaserpr3-xldzgjimi">
+      <w:hyperlink w:history="1" r:id="rId-vbafrg5bn0de6z_9-iju">
         <w:r>
           <w:rPr>
             <w:rStyle w:val="Hyperlink"/>
@@ -472,7 +472,27 @@
         <w:t xml:space="preserve">filter settings</w:t>
       </w:r>
       <w:r>
-        <w:t xml:space="preserve">, set the filters you need, then click </w:t>
+        <w:t xml:space="preserve">, choose the saved </w:t>
+      </w:r>
+      <w:r>
+        <w:rPr>
+          <w:b/>
+          <w:bCs/>
+        </w:rPr>
+        <w:t xml:space="preserve">FT Send</w:t>
+      </w:r>
+      <w:r>
+        <w:t xml:space="preserve"> filter and confirm it has these four conditions (all joined with </w:t>
+      </w:r>
+      <w:r>
+        <w:rPr>
+          <w:b/>
+          <w:bCs/>
+        </w:rPr>
+        <w:t xml:space="preserve">And</w:t>
+      </w:r>
+      <w:r>
+        <w:t xml:space="preserve">), then click </w:t>
       </w:r>
       <w:r>
         <w:rPr>
@@ -482,7 +502,397 @@
         <w:t xml:space="preserve">Apply</w:t>
       </w:r>
       <w:r>
-        <w:t xml:space="preserve">.</w:t>
+        <w:t xml:space="preserve">:</w:t>
+      </w:r>
+    </w:p>
+    <w:p>
+      <w:pPr>
+        <w:spacing w:after="60"/>
+      </w:pPr>
+    </w:p>
+    <w:tbl>
+      <w:tblPr>
+        <w:tblW w:type="dxa" w:w="9360"/>
+        <w:tblBorders>
+          <w:top w:val="single" w:color="auto" w:sz="4"/>
+          <w:left w:val="single" w:color="auto" w:sz="4"/>
+          <w:bottom w:val="single" w:color="auto" w:sz="4"/>
+          <w:right w:val="single" w:color="auto" w:sz="4"/>
+          <w:insideH w:val="single" w:color="auto" w:sz="4"/>
+          <w:insideV w:val="single" w:color="auto" w:sz="4"/>
+        </w:tblBorders>
+      </w:tblPr>
+      <w:tblGrid>
+        <w:gridCol w:w="3000"/>
+        <w:gridCol w:w="3000"/>
+        <w:gridCol w:w="3360"/>
+      </w:tblGrid>
+      <w:tr>
+        <w:tc>
+          <w:tcPr>
+            <w:tcW w:type="dxa" w:w="3000"/>
+            <w:tcBorders>
+              <w:top w:val="single" w:color="BFBFBF" w:sz="4"/>
+              <w:left w:val="single" w:color="BFBFBF" w:sz="4"/>
+              <w:bottom w:val="single" w:color="BFBFBF" w:sz="4"/>
+              <w:right w:val="single" w:color="BFBFBF" w:sz="4"/>
+            </w:tcBorders>
+            <w:shd w:fill="1F4E79" w:color="auto" w:val="clear"/>
+            <w:tcMar>
+              <w:top w:type="dxa" w:w="80"/>
+              <w:left w:type="dxa" w:w="120"/>
+              <w:bottom w:type="dxa" w:w="80"/>
+              <w:right w:type="dxa" w:w="120"/>
+            </w:tcMar>
+          </w:tcPr>
+          <w:p>
+            <w:r>
+              <w:rPr>
+                <w:b/>
+                <w:bCs/>
+                <w:color w:val="FFFFFF"/>
+              </w:rPr>
+              <w:t xml:space="preserve">Property</w:t>
+            </w:r>
+          </w:p>
+        </w:tc>
+        <w:tc>
+          <w:tcPr>
+            <w:tcW w:type="dxa" w:w="3000"/>
+            <w:tcBorders>
+              <w:top w:val="single" w:color="BFBFBF" w:sz="4"/>
+              <w:left w:val="single" w:color="BFBFBF" w:sz="4"/>
+              <w:bottom w:val="single" w:color="BFBFBF" w:sz="4"/>
+              <w:right w:val="single" w:color="BFBFBF" w:sz="4"/>
+            </w:tcBorders>
+            <w:shd w:fill="1F4E79" w:color="auto" w:val="clear"/>
+            <w:tcMar>
+              <w:top w:type="dxa" w:w="80"/>
+              <w:left w:type="dxa" w:w="120"/>
+              <w:bottom w:type="dxa" w:w="80"/>
+              <w:right w:type="dxa" w:w="120"/>
+            </w:tcMar>
+          </w:tcPr>
+          <w:p>
+            <w:r>
+              <w:rPr>
+                <w:b/>
+                <w:bCs/>
+                <w:color w:val="FFFFFF"/>
+              </w:rPr>
+              <w:t xml:space="preserve">Condition</w:t>
+            </w:r>
+          </w:p>
+        </w:tc>
+        <w:tc>
+          <w:tcPr>
+            <w:tcW w:type="dxa" w:w="3360"/>
+            <w:tcBorders>
+              <w:top w:val="single" w:color="BFBFBF" w:sz="4"/>
+              <w:left w:val="single" w:color="BFBFBF" w:sz="4"/>
+              <w:bottom w:val="single" w:color="BFBFBF" w:sz="4"/>
+              <w:right w:val="single" w:color="BFBFBF" w:sz="4"/>
+            </w:tcBorders>
+            <w:shd w:fill="1F4E79" w:color="auto" w:val="clear"/>
+            <w:tcMar>
+              <w:top w:type="dxa" w:w="80"/>
+              <w:left w:type="dxa" w:w="120"/>
+              <w:bottom w:type="dxa" w:w="80"/>
+              <w:right w:type="dxa" w:w="120"/>
+            </w:tcMar>
+          </w:tcPr>
+          <w:p>
+            <w:r>
+              <w:rPr>
+                <w:b/>
+                <w:bCs/>
+                <w:color w:val="FFFFFF"/>
+              </w:rPr>
+              <w:t xml:space="preserve">Value</w:t>
+            </w:r>
+          </w:p>
+        </w:tc>
+      </w:tr>
+      <w:tr>
+        <w:tc>
+          <w:tcPr>
+            <w:tcW w:type="dxa" w:w="3000"/>
+            <w:tcBorders>
+              <w:top w:val="single" w:color="BFBFBF" w:sz="4"/>
+              <w:left w:val="single" w:color="BFBFBF" w:sz="4"/>
+              <w:bottom w:val="single" w:color="BFBFBF" w:sz="4"/>
+              <w:right w:val="single" w:color="BFBFBF" w:sz="4"/>
+            </w:tcBorders>
+            <w:tcMar>
+              <w:top w:type="dxa" w:w="80"/>
+              <w:left w:type="dxa" w:w="120"/>
+              <w:bottom w:type="dxa" w:w="80"/>
+              <w:right w:type="dxa" w:w="120"/>
+            </w:tcMar>
+          </w:tcPr>
+          <w:p>
+            <w:r>
+              <w:t xml:space="preserve">Status</w:t>
+            </w:r>
+          </w:p>
+        </w:tc>
+        <w:tc>
+          <w:tcPr>
+            <w:tcW w:type="dxa" w:w="3000"/>
+            <w:tcBorders>
+              <w:top w:val="single" w:color="BFBFBF" w:sz="4"/>
+              <w:left w:val="single" w:color="BFBFBF" w:sz="4"/>
+              <w:bottom w:val="single" w:color="BFBFBF" w:sz="4"/>
+              <w:right w:val="single" w:color="BFBFBF" w:sz="4"/>
+            </w:tcBorders>
+            <w:tcMar>
+              <w:top w:type="dxa" w:w="80"/>
+              <w:left w:type="dxa" w:w="120"/>
+              <w:bottom w:type="dxa" w:w="80"/>
+              <w:right w:type="dxa" w:w="120"/>
+            </w:tcMar>
+          </w:tcPr>
+          <w:p>
+            <w:r>
+              <w:t xml:space="preserve">Equals</w:t>
+            </w:r>
+          </w:p>
+        </w:tc>
+        <w:tc>
+          <w:tcPr>
+            <w:tcW w:type="dxa" w:w="3360"/>
+            <w:tcBorders>
+              <w:top w:val="single" w:color="BFBFBF" w:sz="4"/>
+              <w:left w:val="single" w:color="BFBFBF" w:sz="4"/>
+              <w:bottom w:val="single" w:color="BFBFBF" w:sz="4"/>
+              <w:right w:val="single" w:color="BFBFBF" w:sz="4"/>
+            </w:tcBorders>
+            <w:tcMar>
+              <w:top w:type="dxa" w:w="80"/>
+              <w:left w:type="dxa" w:w="120"/>
+              <w:bottom w:type="dxa" w:w="80"/>
+              <w:right w:type="dxa" w:w="120"/>
+            </w:tcMar>
+          </w:tcPr>
+          <w:p>
+            <w:r>
+              <w:t xml:space="preserve">Approved</w:t>
+            </w:r>
+          </w:p>
+        </w:tc>
+      </w:tr>
+      <w:tr>
+        <w:tc>
+          <w:tcPr>
+            <w:tcW w:type="dxa" w:w="3000"/>
+            <w:tcBorders>
+              <w:top w:val="single" w:color="BFBFBF" w:sz="4"/>
+              <w:left w:val="single" w:color="BFBFBF" w:sz="4"/>
+              <w:bottom w:val="single" w:color="BFBFBF" w:sz="4"/>
+              <w:right w:val="single" w:color="BFBFBF" w:sz="4"/>
+            </w:tcBorders>
+            <w:tcMar>
+              <w:top w:type="dxa" w:w="80"/>
+              <w:left w:type="dxa" w:w="120"/>
+              <w:bottom w:type="dxa" w:w="80"/>
+              <w:right w:type="dxa" w:w="120"/>
+            </w:tcMar>
+          </w:tcPr>
+          <w:p>
+            <w:r>
+              <w:t xml:space="preserve">Billable</w:t>
+            </w:r>
+          </w:p>
+        </w:tc>
+        <w:tc>
+          <w:tcPr>
+            <w:tcW w:type="dxa" w:w="3000"/>
+            <w:tcBorders>
+              <w:top w:val="single" w:color="BFBFBF" w:sz="4"/>
+              <w:left w:val="single" w:color="BFBFBF" w:sz="4"/>
+              <w:bottom w:val="single" w:color="BFBFBF" w:sz="4"/>
+              <w:right w:val="single" w:color="BFBFBF" w:sz="4"/>
+            </w:tcBorders>
+            <w:tcMar>
+              <w:top w:type="dxa" w:w="80"/>
+              <w:left w:type="dxa" w:w="120"/>
+              <w:bottom w:type="dxa" w:w="80"/>
+              <w:right w:type="dxa" w:w="120"/>
+            </w:tcMar>
+          </w:tcPr>
+          <w:p>
+            <w:r>
+              <w:t xml:space="preserve">Equals</w:t>
+            </w:r>
+          </w:p>
+        </w:tc>
+        <w:tc>
+          <w:tcPr>
+            <w:tcW w:type="dxa" w:w="3360"/>
+            <w:tcBorders>
+              <w:top w:val="single" w:color="BFBFBF" w:sz="4"/>
+              <w:left w:val="single" w:color="BFBFBF" w:sz="4"/>
+              <w:bottom w:val="single" w:color="BFBFBF" w:sz="4"/>
+              <w:right w:val="single" w:color="BFBFBF" w:sz="4"/>
+            </w:tcBorders>
+            <w:tcMar>
+              <w:top w:type="dxa" w:w="80"/>
+              <w:left w:type="dxa" w:w="120"/>
+              <w:bottom w:type="dxa" w:w="80"/>
+              <w:right w:type="dxa" w:w="120"/>
+            </w:tcMar>
+          </w:tcPr>
+          <w:p>
+            <w:r>
+              <w:t xml:space="preserve">☑ (checked)</w:t>
+            </w:r>
+          </w:p>
+        </w:tc>
+      </w:tr>
+      <w:tr>
+        <w:tc>
+          <w:tcPr>
+            <w:tcW w:type="dxa" w:w="3000"/>
+            <w:tcBorders>
+              <w:top w:val="single" w:color="BFBFBF" w:sz="4"/>
+              <w:left w:val="single" w:color="BFBFBF" w:sz="4"/>
+              <w:bottom w:val="single" w:color="BFBFBF" w:sz="4"/>
+              <w:right w:val="single" w:color="BFBFBF" w:sz="4"/>
+            </w:tcBorders>
+            <w:tcMar>
+              <w:top w:type="dxa" w:w="80"/>
+              <w:left w:type="dxa" w:w="120"/>
+              <w:bottom w:type="dxa" w:w="80"/>
+              <w:right w:type="dxa" w:w="120"/>
+            </w:tcMar>
+          </w:tcPr>
+          <w:p>
+            <w:r>
+              <w:t xml:space="preserve">Customer Sent Date</w:t>
+            </w:r>
+          </w:p>
+        </w:tc>
+        <w:tc>
+          <w:tcPr>
+            <w:tcW w:type="dxa" w:w="3000"/>
+            <w:tcBorders>
+              <w:top w:val="single" w:color="BFBFBF" w:sz="4"/>
+              <w:left w:val="single" w:color="BFBFBF" w:sz="4"/>
+              <w:bottom w:val="single" w:color="BFBFBF" w:sz="4"/>
+              <w:right w:val="single" w:color="BFBFBF" w:sz="4"/>
+            </w:tcBorders>
+            <w:tcMar>
+              <w:top w:type="dxa" w:w="80"/>
+              <w:left w:type="dxa" w:w="120"/>
+              <w:bottom w:type="dxa" w:w="80"/>
+              <w:right w:type="dxa" w:w="120"/>
+            </w:tcMar>
+          </w:tcPr>
+          <w:p>
+            <w:r>
+              <w:t xml:space="preserve">Is Empty</w:t>
+            </w:r>
+          </w:p>
+        </w:tc>
+        <w:tc>
+          <w:tcPr>
+            <w:tcW w:type="dxa" w:w="3360"/>
+            <w:tcBorders>
+              <w:top w:val="single" w:color="BFBFBF" w:sz="4"/>
+              <w:left w:val="single" w:color="BFBFBF" w:sz="4"/>
+              <w:bottom w:val="single" w:color="BFBFBF" w:sz="4"/>
+              <w:right w:val="single" w:color="BFBFBF" w:sz="4"/>
+            </w:tcBorders>
+            <w:tcMar>
+              <w:top w:type="dxa" w:w="80"/>
+              <w:left w:type="dxa" w:w="120"/>
+              <w:bottom w:type="dxa" w:w="80"/>
+              <w:right w:type="dxa" w:w="120"/>
+            </w:tcMar>
+          </w:tcPr>
+          <w:p>
+            <w:r>
+              <w:t xml:space="preserve"/>
+            </w:r>
+          </w:p>
+        </w:tc>
+      </w:tr>
+      <w:tr>
+        <w:tc>
+          <w:tcPr>
+            <w:tcW w:type="dxa" w:w="3000"/>
+            <w:tcBorders>
+              <w:top w:val="single" w:color="BFBFBF" w:sz="4"/>
+              <w:left w:val="single" w:color="BFBFBF" w:sz="4"/>
+              <w:bottom w:val="single" w:color="BFBFBF" w:sz="4"/>
+              <w:right w:val="single" w:color="BFBFBF" w:sz="4"/>
+            </w:tcBorders>
+            <w:tcMar>
+              <w:top w:type="dxa" w:w="80"/>
+              <w:left w:type="dxa" w:w="120"/>
+              <w:bottom w:type="dxa" w:w="80"/>
+              <w:right w:type="dxa" w:w="120"/>
+            </w:tcMar>
+          </w:tcPr>
+          <w:p>
+            <w:r>
+              <w:t xml:space="preserve">Description</w:t>
+            </w:r>
+          </w:p>
+        </w:tc>
+        <w:tc>
+          <w:tcPr>
+            <w:tcW w:type="dxa" w:w="3000"/>
+            <w:tcBorders>
+              <w:top w:val="single" w:color="BFBFBF" w:sz="4"/>
+              <w:left w:val="single" w:color="BFBFBF" w:sz="4"/>
+              <w:bottom w:val="single" w:color="BFBFBF" w:sz="4"/>
+              <w:right w:val="single" w:color="BFBFBF" w:sz="4"/>
+            </w:tcBorders>
+            <w:tcMar>
+              <w:top w:type="dxa" w:w="80"/>
+              <w:left w:type="dxa" w:w="120"/>
+              <w:bottom w:type="dxa" w:w="80"/>
+              <w:right w:type="dxa" w:w="120"/>
+            </w:tcMar>
+          </w:tcPr>
+          <w:p>
+            <w:r>
+              <w:t xml:space="preserve">Does Not Contain</w:t>
+            </w:r>
+          </w:p>
+        </w:tc>
+        <w:tc>
+          <w:tcPr>
+            <w:tcW w:type="dxa" w:w="3360"/>
+            <w:tcBorders>
+              <w:top w:val="single" w:color="BFBFBF" w:sz="4"/>
+              <w:left w:val="single" w:color="BFBFBF" w:sz="4"/>
+              <w:bottom w:val="single" w:color="BFBFBF" w:sz="4"/>
+              <w:right w:val="single" w:color="BFBFBF" w:sz="4"/>
+            </w:tcBorders>
+            <w:tcMar>
+              <w:top w:type="dxa" w:w="80"/>
+              <w:left w:type="dxa" w:w="120"/>
+              <w:bottom w:type="dxa" w:w="80"/>
+              <w:right w:type="dxa" w:w="120"/>
+            </w:tcMar>
+          </w:tcPr>
+          <w:p>
+            <w:r>
+              <w:t xml:space="preserve">Lebanon</w:t>
+            </w:r>
+          </w:p>
+        </w:tc>
+      </w:tr>
+    </w:tbl>
+    <w:p>
+      <w:pPr>
+        <w:spacing w:after="120" w:before="120"/>
+        <w:ind w:left="540"/>
+      </w:pPr>
+      <w:r>
+        <w:t xml:space="preserve">Every ticket left in the list still needs to go to the client. Work through them one at a time with steps 5–16.</w:t>
       </w:r>
     </w:p>
     <w:p>

</xml_diff>

<commit_message>
SOP: Customer Sent Date is the day the PDF is made
Co-Authored-By: Claude Opus 5.5 <noreply@anthropic.com>
Claude-Session: https://claude.ai/code/session_013DfoHr5TuhrWfy46zgxpYj
</commit_message>
<xml_diff>
--- a/docs/sop/Field Ticket PDF and E-Sign SOP.docx
+++ b/docs/sop/Field Ticket PDF and E-Sign SOP.docx
@@ -186,7 +186,7 @@
             </w:tcMar>
           </w:tcPr>
           <w:p>
-            <w:hyperlink w:history="1" r:id="rIdbxi8i1k6a07xggkswsisa">
+            <w:hyperlink w:history="1" r:id="rId57dmkikhjycvtifu1bxhk">
               <w:r>
                 <w:rPr>
                   <w:rStyle w:val="Hyperlink"/>
@@ -318,7 +318,7 @@
         </w:numPr>
         <w:spacing w:after="80"/>
       </w:pPr>
-      <w:hyperlink w:history="1" r:id="rIdqfdcxijatpsga5b07o1xz">
+      <w:hyperlink w:history="1" r:id="rId1dblyjrt3mgtc-ox23a9u">
         <w:r>
           <w:rPr>
             <w:rStyle w:val="Hyperlink"/>
@@ -394,7 +394,7 @@
       <w:r>
         <w:t xml:space="preserve">: </w:t>
       </w:r>
-      <w:hyperlink w:history="1" r:id="rId-vbafrg5bn0de6z_9-iju">
+      <w:hyperlink w:history="1" r:id="rIdgve86hqhgtrabvvzgpfph">
         <w:r>
           <w:rPr>
             <w:rStyle w:val="Hyperlink"/>
@@ -969,7 +969,7 @@
         <w:t xml:space="preserve">today's date</w:t>
       </w:r>
       <w:r>
-        <w:t xml:space="preserve">.</w:t>
+        <w:t xml:space="preserve"> (the day the PDF is made, even if the Adobe agreement is sent on a later day).</w:t>
       </w:r>
     </w:p>
     <w:p>

</xml_diff>